<commit_message>
feat: improve multi-bridge reports and assessment tables
</commit_message>
<xml_diff>
--- a/bi-biz/src/main/resources/word.biz/定期检查_普通桥梁线路多桥服务端模板-页眉.docx
+++ b/bi-biz/src/main/resources/word.biz/定期检查_普通桥梁线路多桥服务端模板-页眉.docx
@@ -5780,13 +5780,13 @@
           <w:szCs w:val="32"/>
         </w:rPr>
       </w:pPr>
-      <w:bookmarkStart w:id="3" w:name="_Toc213786562"/>
-      <w:bookmarkStart w:id="4" w:name="_Toc153983764"/>
-      <w:bookmarkStart w:id="5" w:name="_Toc168717081"/>
-      <w:bookmarkStart w:id="6" w:name="_Toc9625"/>
+      <w:bookmarkStart w:id="3" w:name="_Toc153983764"/>
+      <w:bookmarkStart w:id="4" w:name="_Toc213786562"/>
+      <w:bookmarkStart w:id="5" w:name="_Toc168716129"/>
+      <w:bookmarkStart w:id="6" w:name="_Toc168717081"/>
       <w:bookmarkStart w:id="7" w:name="_Toc153817471"/>
-      <w:bookmarkStart w:id="8" w:name="_Toc168716129"/>
-      <w:bookmarkStart w:id="9" w:name="_Toc14337"/>
+      <w:bookmarkStart w:id="8" w:name="_Toc14337"/>
+      <w:bookmarkStart w:id="9" w:name="_Toc9625"/>
       <w:r>
         <w:rPr>
           <w:rFonts w:hint="eastAsia" w:ascii="Times New Roman" w:hAnsi="Times New Roman"/>
@@ -5935,9 +5935,9 @@
           <w:rFonts w:ascii="Times New Roman" w:hAnsi="Times New Roman" w:cs="Times New Roman"/>
         </w:rPr>
       </w:pPr>
-      <w:bookmarkStart w:id="14" w:name="_Toc153817482"/>
-      <w:bookmarkStart w:id="15" w:name="_Toc88494887"/>
-      <w:bookmarkStart w:id="16" w:name="_Toc213786565"/>
+      <w:bookmarkStart w:id="14" w:name="_Toc213786565"/>
+      <w:bookmarkStart w:id="15" w:name="_Toc153817482"/>
+      <w:bookmarkStart w:id="16" w:name="_Toc88494887"/>
       <w:r>
         <w:rPr>
           <w:rFonts w:ascii="Times New Roman" w:hAnsi="Times New Roman" w:cs="Times New Roman"/>
@@ -6017,8 +6017,8 @@
             <w:pPr>
               <w:jc w:val="center"/>
             </w:pPr>
-            <w:bookmarkStart w:id="18" w:name="_Toc213786567"/>
-            <w:bookmarkStart w:id="19" w:name="_Toc85475339"/>
+            <w:bookmarkStart w:id="18" w:name="_Toc85475339"/>
+            <w:bookmarkStart w:id="19" w:name="_Toc213786567"/>
             <w:bookmarkStart w:id="20" w:name="_Toc103020307"/>
             <w:bookmarkStart w:id="21" w:name="_Toc153817483"/>
             <w:r>
@@ -6483,8 +6483,8 @@
           <w:rFonts w:cs="Times New Roman"/>
         </w:rPr>
       </w:pPr>
+      <w:commentRangeStart w:id="1"/>
       <w:bookmarkStart w:id="24" w:name="_Toc213786570"/>
-      <w:commentRangeStart w:id="1"/>
       <w:r>
         <w:rPr>
           <w:rFonts w:hint="eastAsia" w:cs="Times New Roman"/>
@@ -7000,6 +7000,28 @@
       </w:r>
       <w:bookmarkEnd w:id="38"/>
     </w:p>
+    <w:p>
+      <w:pPr>
+        <w:keepNext w:val="0"/>
+        <w:keepLines w:val="0"/>
+        <w:widowControl/>
+        <w:suppressLineNumbers w:val="0"/>
+        <w:jc w:val="left"/>
+      </w:pPr>
+      <w:r>
+        <w:rPr>
+          <w:rFonts w:ascii="宋体" w:hAnsi="宋体" w:eastAsia="宋体" w:cs="宋体"/>
+          <w:color w:val="000000"/>
+          <w:kern w:val="0"/>
+          <w:sz w:val="24"/>
+          <w:szCs w:val="24"/>
+          <w:lang w:val="en-US" w:eastAsia="zh-CN" w:bidi="ar"/>
+        </w:rPr>
+        <w:t>${carbonizationAssessment}</w:t>
+      </w:r>
+      <w:bookmarkStart w:id="50" w:name="_GoBack"/>
+      <w:bookmarkEnd w:id="50"/>
+    </w:p>
     <w:bookmarkEnd w:id="39"/>
     <w:p>
       <w:pPr>
@@ -7061,8 +7083,6 @@
         </w:rPr>
         <w:t>${keyConcernDiseases}</w:t>
       </w:r>
-      <w:bookmarkStart w:id="50" w:name="_GoBack"/>
-      <w:bookmarkEnd w:id="50"/>
     </w:p>
     <w:p>
       <w:pPr>

</xml_diff>

<commit_message>
feat(report): support Word section imports and fix report layout
</commit_message>
<xml_diff>
--- a/bi-biz/src/main/resources/word.biz/定期检查_普通桥梁线路多桥服务端模板-页眉.docx
+++ b/bi-biz/src/main/resources/word.biz/定期检查_普通桥梁线路多桥服务端模板-页眉.docx
@@ -5782,11 +5782,11 @@
       </w:pPr>
       <w:bookmarkStart w:id="3" w:name="_Toc153983764"/>
       <w:bookmarkStart w:id="4" w:name="_Toc213786562"/>
-      <w:bookmarkStart w:id="5" w:name="_Toc168716129"/>
-      <w:bookmarkStart w:id="6" w:name="_Toc168717081"/>
-      <w:bookmarkStart w:id="7" w:name="_Toc153817471"/>
-      <w:bookmarkStart w:id="8" w:name="_Toc14337"/>
-      <w:bookmarkStart w:id="9" w:name="_Toc9625"/>
+      <w:bookmarkStart w:id="5" w:name="_Toc153817471"/>
+      <w:bookmarkStart w:id="6" w:name="_Toc9625"/>
+      <w:bookmarkStart w:id="7" w:name="_Toc14337"/>
+      <w:bookmarkStart w:id="8" w:name="_Toc168716129"/>
+      <w:bookmarkStart w:id="9" w:name="_Toc168717081"/>
       <w:r>
         <w:rPr>
           <w:rFonts w:hint="eastAsia" w:ascii="Times New Roman" w:hAnsi="Times New Roman"/>
@@ -5935,9 +5935,9 @@
           <w:rFonts w:ascii="Times New Roman" w:hAnsi="Times New Roman" w:cs="Times New Roman"/>
         </w:rPr>
       </w:pPr>
-      <w:bookmarkStart w:id="14" w:name="_Toc213786565"/>
-      <w:bookmarkStart w:id="15" w:name="_Toc153817482"/>
-      <w:bookmarkStart w:id="16" w:name="_Toc88494887"/>
+      <w:bookmarkStart w:id="14" w:name="_Toc88494887"/>
+      <w:bookmarkStart w:id="15" w:name="_Toc213786565"/>
+      <w:bookmarkStart w:id="16" w:name="_Toc153817482"/>
       <w:r>
         <w:rPr>
           <w:rFonts w:ascii="Times New Roman" w:hAnsi="Times New Roman" w:cs="Times New Roman"/>
@@ -6017,8 +6017,8 @@
             <w:pPr>
               <w:jc w:val="center"/>
             </w:pPr>
-            <w:bookmarkStart w:id="18" w:name="_Toc85475339"/>
-            <w:bookmarkStart w:id="19" w:name="_Toc213786567"/>
+            <w:bookmarkStart w:id="18" w:name="_Toc213786567"/>
+            <w:bookmarkStart w:id="19" w:name="_Toc85475339"/>
             <w:bookmarkStart w:id="20" w:name="_Toc103020307"/>
             <w:bookmarkStart w:id="21" w:name="_Toc153817483"/>
             <w:r>
@@ -6459,8 +6459,8 @@
           <w:rFonts w:cs="Times New Roman"/>
         </w:rPr>
       </w:pPr>
-      <w:bookmarkStart w:id="22" w:name="_Toc85475340"/>
-      <w:bookmarkStart w:id="23" w:name="_Toc213786568"/>
+      <w:bookmarkStart w:id="22" w:name="_Toc213786568"/>
+      <w:bookmarkStart w:id="23" w:name="_Toc85475340"/>
       <w:r>
         <w:rPr>
           <w:rFonts w:hint="eastAsia" w:cs="Times New Roman"/>
@@ -6724,8 +6724,6 @@
     </w:p>
     <w:p>
       <w:pPr>
-        <w:pStyle w:val="128"/>
-        <w:ind w:left="0" w:leftChars="0" w:firstLine="0" w:firstLineChars="0"/>
         <w:rPr>
           <w:rFonts w:ascii="Times New Roman" w:hAnsi="Times New Roman"/>
         </w:rPr>
@@ -6738,10 +6736,13 @@
           <w:docGrid w:type="lines" w:linePitch="326" w:charSpace="0"/>
         </w:sectPr>
       </w:pPr>
+      <w:bookmarkStart w:id="50" w:name="_GoBack"/>
+      <w:bookmarkEnd w:id="50"/>
     </w:p>
     <w:p>
       <w:pPr>
         <w:pStyle w:val="128"/>
+        <w:ind w:left="0" w:leftChars="0" w:firstLine="0" w:firstLineChars="0"/>
         <w:rPr>
           <w:rFonts w:ascii="Times New Roman" w:hAnsi="Times New Roman"/>
         </w:rPr>
@@ -6759,8 +6760,8 @@
         </w:rPr>
       </w:pPr>
       <w:bookmarkStart w:id="29" w:name="_Toc213786588"/>
-      <w:bookmarkStart w:id="30" w:name="_Toc129268779"/>
-      <w:bookmarkStart w:id="31" w:name="_Toc213786580"/>
+      <w:bookmarkStart w:id="30" w:name="_Toc213786580"/>
+      <w:bookmarkStart w:id="31" w:name="_Toc129268779"/>
       <w:r>
         <w:rPr>
           <w:rFonts w:hint="eastAsia" w:ascii="Times New Roman" w:hAnsi="Times New Roman" w:cs="Times New Roman"/>
@@ -7019,8 +7020,6 @@
         </w:rPr>
         <w:t>${carbonizationAssessment}</w:t>
       </w:r>
-      <w:bookmarkStart w:id="50" w:name="_GoBack"/>
-      <w:bookmarkEnd w:id="50"/>
     </w:p>
     <w:bookmarkEnd w:id="39"/>
     <w:p>
@@ -7035,8 +7034,8 @@
       </w:pPr>
       <w:bookmarkStart w:id="40" w:name="_Toc213786590"/>
       <w:bookmarkStart w:id="41" w:name="_Hlk178890662"/>
-      <w:bookmarkStart w:id="42" w:name="_Toc153817495"/>
-      <w:bookmarkStart w:id="43" w:name="_Toc103020335"/>
+      <w:bookmarkStart w:id="42" w:name="_Toc103020335"/>
+      <w:bookmarkStart w:id="43" w:name="_Toc153817495"/>
       <w:r>
         <w:rPr>
           <w:rFonts w:hint="eastAsia" w:ascii="Times New Roman" w:hAnsi="Times New Roman" w:cs="Times New Roman"/>
@@ -7227,8 +7226,8 @@
           <w:szCs w:val="28"/>
         </w:rPr>
       </w:pPr>
-      <w:bookmarkStart w:id="47" w:name="_Toc11318254"/>
-      <w:bookmarkStart w:id="48" w:name="_Toc178925821"/>
+      <w:bookmarkStart w:id="47" w:name="_Toc178925821"/>
+      <w:bookmarkStart w:id="48" w:name="_Toc11318254"/>
       <w:r>
         <w:rPr>
           <w:rFonts w:hint="eastAsia" w:ascii="黑体" w:hAnsi="黑体" w:eastAsia="黑体" w:cs="黑体"/>

</xml_diff>

<commit_message>
feat(report): add component maintenance rules and configurable report headers
</commit_message>
<xml_diff>
--- a/bi-biz/src/main/resources/word.biz/定期检查_普通桥梁线路多桥服务端模板-页眉.docx
+++ b/bi-biz/src/main/resources/word.biz/定期检查_普通桥梁线路多桥服务端模板-页眉.docx
@@ -12,6 +12,8 @@
           <w:szCs w:val="44"/>
         </w:rPr>
       </w:pPr>
+      <w:bookmarkStart w:id="50" w:name="_GoBack"/>
+      <w:bookmarkEnd w:id="50"/>
       <w:r>
         <w:rPr>
           <w:rFonts w:hint="eastAsia" w:eastAsia="黑体"/>
@@ -5782,11 +5784,11 @@
       </w:pPr>
       <w:bookmarkStart w:id="3" w:name="_Toc153983764"/>
       <w:bookmarkStart w:id="4" w:name="_Toc213786562"/>
-      <w:bookmarkStart w:id="5" w:name="_Toc153817471"/>
-      <w:bookmarkStart w:id="6" w:name="_Toc9625"/>
-      <w:bookmarkStart w:id="7" w:name="_Toc14337"/>
-      <w:bookmarkStart w:id="8" w:name="_Toc168716129"/>
-      <w:bookmarkStart w:id="9" w:name="_Toc168717081"/>
+      <w:bookmarkStart w:id="5" w:name="_Toc9625"/>
+      <w:bookmarkStart w:id="6" w:name="_Toc168716129"/>
+      <w:bookmarkStart w:id="7" w:name="_Toc168717081"/>
+      <w:bookmarkStart w:id="8" w:name="_Toc14337"/>
+      <w:bookmarkStart w:id="9" w:name="_Toc153817471"/>
       <w:r>
         <w:rPr>
           <w:rFonts w:hint="eastAsia" w:ascii="Times New Roman" w:hAnsi="Times New Roman"/>
@@ -5816,8 +5818,8 @@
           <w:szCs w:val="32"/>
         </w:rPr>
       </w:pPr>
-      <w:bookmarkStart w:id="11" w:name="_Toc213786563"/>
-      <w:bookmarkStart w:id="12" w:name="_Toc153983776"/>
+      <w:bookmarkStart w:id="11" w:name="_Toc153983776"/>
+      <w:bookmarkStart w:id="12" w:name="_Toc213786563"/>
       <w:r>
         <w:rPr>
           <w:rFonts w:hint="eastAsia" w:ascii="Times New Roman" w:hAnsi="Times New Roman"/>
@@ -5879,8 +5881,8 @@
           <w:szCs w:val="32"/>
         </w:rPr>
       </w:pPr>
+      <w:bookmarkStart w:id="13" w:name="_Toc213786587"/>
       <w:commentRangeStart w:id="0"/>
-      <w:bookmarkStart w:id="13" w:name="_Toc213786587"/>
       <w:r>
         <w:rPr>
           <w:rFonts w:hint="eastAsia" w:ascii="Times New Roman" w:hAnsi="Times New Roman"/>
@@ -5935,9 +5937,9 @@
           <w:rFonts w:ascii="Times New Roman" w:hAnsi="Times New Roman" w:cs="Times New Roman"/>
         </w:rPr>
       </w:pPr>
-      <w:bookmarkStart w:id="14" w:name="_Toc88494887"/>
+      <w:bookmarkStart w:id="14" w:name="_Toc153817482"/>
       <w:bookmarkStart w:id="15" w:name="_Toc213786565"/>
-      <w:bookmarkStart w:id="16" w:name="_Toc153817482"/>
+      <w:bookmarkStart w:id="16" w:name="_Toc88494887"/>
       <w:r>
         <w:rPr>
           <w:rFonts w:ascii="Times New Roman" w:hAnsi="Times New Roman" w:cs="Times New Roman"/>
@@ -6522,8 +6524,8 @@
           <w:rFonts w:cs="Times New Roman"/>
         </w:rPr>
       </w:pPr>
+      <w:commentRangeStart w:id="2"/>
       <w:bookmarkStart w:id="25" w:name="_Toc213786571"/>
-      <w:commentRangeStart w:id="2"/>
       <w:r>
         <w:rPr>
           <w:rFonts w:hint="eastAsia" w:cs="Times New Roman"/>
@@ -6736,8 +6738,6 @@
           <w:docGrid w:type="lines" w:linePitch="326" w:charSpace="0"/>
         </w:sectPr>
       </w:pPr>
-      <w:bookmarkStart w:id="50" w:name="_GoBack"/>
-      <w:bookmarkEnd w:id="50"/>
     </w:p>
     <w:p>
       <w:pPr>
@@ -6760,8 +6760,8 @@
         </w:rPr>
       </w:pPr>
       <w:bookmarkStart w:id="29" w:name="_Toc213786588"/>
-      <w:bookmarkStart w:id="30" w:name="_Toc213786580"/>
-      <w:bookmarkStart w:id="31" w:name="_Toc129268779"/>
+      <w:bookmarkStart w:id="30" w:name="_Toc129268779"/>
+      <w:bookmarkStart w:id="31" w:name="_Toc213786580"/>
       <w:r>
         <w:rPr>
           <w:rFonts w:hint="eastAsia" w:ascii="Times New Roman" w:hAnsi="Times New Roman" w:cs="Times New Roman"/>
@@ -27294,7 +27294,7 @@
     </w:pPr>
     <w:r>
       <w:rPr>
-        <w:rFonts w:hint="eastAsia"/>
+        <w:rFonts w:hint="eastAsia" w:ascii="黑体" w:hAnsi="黑体" w:eastAsia="黑体" w:cs="黑体"/>
         <w:color w:val="000000" w:themeColor="text1"/>
         <w14:textFill>
           <w14:solidFill>
@@ -27302,7 +27302,7 @@
           </w14:solidFill>
         </w14:textFill>
       </w:rPr>
-      <w:t>洪监高速公路养护检查等级Ⅰ级桥梁（连续梁、连续刚构桥）定期检测报告</w:t>
+      <w:t>${line-report-header}</w:t>
     </w:r>
     <w:r>
       <w:rPr>
@@ -27381,7 +27381,7 @@
     </w:pPr>
     <w:r>
       <w:rPr>
-        <w:rFonts w:hint="eastAsia"/>
+        <w:rFonts w:hint="eastAsia" w:ascii="黑体" w:hAnsi="黑体" w:eastAsia="黑体" w:cs="黑体"/>
         <w:color w:val="000000" w:themeColor="text1"/>
         <w14:textFill>
           <w14:solidFill>
@@ -27389,7 +27389,7 @@
           </w14:solidFill>
         </w14:textFill>
       </w:rPr>
-      <w:t>洪监高速公路养护检查等级Ⅰ级桥梁（连续梁、连续刚构桥）定期检测报告</w:t>
+      <w:t>${line-report-header}</w:t>
     </w:r>
     <w:r>
       <w:rPr>
@@ -27468,7 +27468,7 @@
     </w:pPr>
     <w:r>
       <w:rPr>
-        <w:rFonts w:hint="eastAsia"/>
+        <w:rFonts w:hint="eastAsia" w:ascii="黑体" w:hAnsi="黑体" w:eastAsia="黑体" w:cs="黑体"/>
         <w:color w:val="000000" w:themeColor="text1"/>
         <w14:textFill>
           <w14:solidFill>
@@ -27476,7 +27476,7 @@
           </w14:solidFill>
         </w14:textFill>
       </w:rPr>
-      <w:t>洪监高速公路养护检查等级Ⅰ级桥梁（连续梁、连续刚构桥）定期检测报告</w:t>
+      <w:t>${line-report-header}</w:t>
     </w:r>
     <w:r>
       <w:rPr>
@@ -27555,7 +27555,7 @@
     </w:pPr>
     <w:r>
       <w:rPr>
-        <w:rFonts w:hint="eastAsia"/>
+        <w:rFonts w:hint="eastAsia" w:ascii="黑体" w:hAnsi="黑体" w:eastAsia="黑体" w:cs="黑体"/>
         <w:color w:val="000000" w:themeColor="text1"/>
         <w14:textFill>
           <w14:solidFill>
@@ -27563,7 +27563,7 @@
           </w14:solidFill>
         </w14:textFill>
       </w:rPr>
-      <w:t>洪监高速公路养护检查等级Ⅰ级桥梁（连续梁、连续刚构桥）定期检测报告</w:t>
+      <w:t>${line-report-header}</w:t>
     </w:r>
     <w:r>
       <w:rPr>
@@ -27642,7 +27642,7 @@
     </w:pPr>
     <w:r>
       <w:rPr>
-        <w:rFonts w:hint="eastAsia"/>
+        <w:rFonts w:hint="eastAsia" w:ascii="黑体" w:hAnsi="黑体" w:eastAsia="黑体" w:cs="黑体"/>
         <w:color w:val="000000" w:themeColor="text1"/>
         <w14:textFill>
           <w14:solidFill>
@@ -27650,7 +27650,7 @@
           </w14:solidFill>
         </w14:textFill>
       </w:rPr>
-      <w:t>洪监高速公路养护检查等级Ⅰ级桥梁（连续梁、连续刚构桥）定期检测报告</w:t>
+      <w:t>${line-report-header}</w:t>
     </w:r>
     <w:r>
       <w:rPr>

</xml_diff>